<commit_message>
[FIX] Validacion Repo v1.1 CFA + Ajustes
</commit_message>
<xml_diff>
--- a/fuentes/CF1_63310037_DU.docx
+++ b/fuentes/CF1_63310037_DU.docx
@@ -515,9 +515,6 @@
         <w:p>
           <w:pPr>
             <w:pStyle w:val="TDC1"/>
-            <w:tabs>
-              <w:tab w:val="right" w:leader="dot" w:pos="10338"/>
-            </w:tabs>
             <w:rPr>
               <w:rFonts w:eastAsiaTheme="minorEastAsia"/>
               <w:noProof/>
@@ -561,7 +558,7 @@
                 <w:noProof/>
                 <w:webHidden/>
               </w:rPr>
-              <w:tab/>
+              <w:t>…………………………………………………………………………………………………………….</w:t>
             </w:r>
             <w:r>
               <w:rPr>
@@ -609,10 +606,6 @@
         <w:p>
           <w:pPr>
             <w:pStyle w:val="TDC1"/>
-            <w:tabs>
-              <w:tab w:val="left" w:pos="9498"/>
-              <w:tab w:val="right" w:leader="dot" w:pos="10338"/>
-            </w:tabs>
             <w:rPr>
               <w:rFonts w:eastAsiaTheme="minorEastAsia"/>
               <w:noProof/>
@@ -628,14 +621,49 @@
                 <w:rStyle w:val="Hipervnculo"/>
                 <w:noProof/>
               </w:rPr>
-              <w:t>1.Métodos de investigación</w:t>
+              <w:t>1.</w:t>
+            </w:r>
+            <w:r>
+              <w:rPr>
+                <w:rStyle w:val="Hipervnculo"/>
+                <w:noProof/>
+              </w:rPr>
+              <w:t xml:space="preserve"> </w:t>
+            </w:r>
+            <w:r>
+              <w:rPr>
+                <w:rStyle w:val="Hipervnculo"/>
+                <w:noProof/>
+              </w:rPr>
+              <w:t>M</w:t>
+            </w:r>
+            <w:r>
+              <w:rPr>
+                <w:rStyle w:val="Hipervnculo"/>
+                <w:noProof/>
+              </w:rPr>
+              <w:t>étodos de investigación</w:t>
             </w:r>
             <w:r>
               <w:rPr>
                 <w:noProof/>
                 <w:webHidden/>
               </w:rPr>
-              <w:t>………………………………………………………………………………………</w:t>
+              <w:t>……………………………………………………………………………</w:t>
+            </w:r>
+            <w:r>
+              <w:rPr>
+                <w:noProof/>
+                <w:webHidden/>
+              </w:rPr>
+              <w:t>….</w:t>
+            </w:r>
+            <w:r>
+              <w:rPr>
+                <w:noProof/>
+                <w:webHidden/>
+              </w:rPr>
+              <w:t>……</w:t>
             </w:r>
             <w:r>
               <w:rPr>
@@ -849,10 +877,6 @@
         <w:p>
           <w:pPr>
             <w:pStyle w:val="TDC1"/>
-            <w:tabs>
-              <w:tab w:val="left" w:pos="9498"/>
-              <w:tab w:val="right" w:leader="dot" w:pos="10338"/>
-            </w:tabs>
             <w:rPr>
               <w:rFonts w:eastAsiaTheme="minorEastAsia"/>
               <w:noProof/>
@@ -868,14 +892,42 @@
                 <w:rStyle w:val="Hipervnculo"/>
                 <w:noProof/>
               </w:rPr>
-              <w:t>2.Base de datos</w:t>
+              <w:t>2.</w:t>
             </w:r>
             <w:r>
               <w:rPr>
                 <w:rStyle w:val="Hipervnculo"/>
                 <w:noProof/>
               </w:rPr>
-              <w:t>……………………………………………………………………………………………………...</w:t>
+              <w:t xml:space="preserve"> </w:t>
+            </w:r>
+            <w:r>
+              <w:rPr>
+                <w:rStyle w:val="Hipervnculo"/>
+                <w:noProof/>
+              </w:rPr>
+              <w:t>Base de datos</w:t>
+            </w:r>
+            <w:r>
+              <w:rPr>
+                <w:rStyle w:val="Hipervnculo"/>
+                <w:noProof/>
+              </w:rPr>
+              <w:t>…………………………………………………………………………………………</w:t>
+            </w:r>
+            <w:r>
+              <w:rPr>
+                <w:rStyle w:val="Hipervnculo"/>
+                <w:noProof/>
+              </w:rPr>
+              <w:t>….</w:t>
+            </w:r>
+            <w:r>
+              <w:rPr>
+                <w:rStyle w:val="Hipervnculo"/>
+                <w:noProof/>
+              </w:rPr>
+              <w:t>……...</w:t>
             </w:r>
             <w:r>
               <w:rPr>
@@ -1006,10 +1058,6 @@
         <w:p>
           <w:pPr>
             <w:pStyle w:val="TDC1"/>
-            <w:tabs>
-              <w:tab w:val="left" w:pos="9498"/>
-              <w:tab w:val="right" w:leader="dot" w:pos="10338"/>
-            </w:tabs>
             <w:rPr>
               <w:rFonts w:eastAsiaTheme="minorEastAsia"/>
               <w:noProof/>
@@ -1025,14 +1073,42 @@
                 <w:rStyle w:val="Hipervnculo"/>
                 <w:noProof/>
               </w:rPr>
-              <w:t>3.Motivaciones de viaje</w:t>
+              <w:t>3.</w:t>
             </w:r>
             <w:r>
               <w:rPr>
                 <w:rStyle w:val="Hipervnculo"/>
                 <w:noProof/>
               </w:rPr>
-              <w:t>………………………………………………………………………………………….</w:t>
+              <w:t xml:space="preserve"> </w:t>
+            </w:r>
+            <w:r>
+              <w:rPr>
+                <w:rStyle w:val="Hipervnculo"/>
+                <w:noProof/>
+              </w:rPr>
+              <w:t>Motivaciones de viaje</w:t>
+            </w:r>
+            <w:r>
+              <w:rPr>
+                <w:rStyle w:val="Hipervnculo"/>
+                <w:noProof/>
+              </w:rPr>
+              <w:t>……………………………………………………………………</w:t>
+            </w:r>
+            <w:r>
+              <w:rPr>
+                <w:rStyle w:val="Hipervnculo"/>
+                <w:noProof/>
+              </w:rPr>
+              <w:t>..</w:t>
+            </w:r>
+            <w:r>
+              <w:rPr>
+                <w:rStyle w:val="Hipervnculo"/>
+                <w:noProof/>
+              </w:rPr>
+              <w:t>………………….</w:t>
             </w:r>
             <w:r>
               <w:rPr>
@@ -1080,10 +1156,6 @@
         <w:p>
           <w:pPr>
             <w:pStyle w:val="TDC1"/>
-            <w:tabs>
-              <w:tab w:val="left" w:pos="9498"/>
-              <w:tab w:val="right" w:leader="dot" w:pos="10338"/>
-            </w:tabs>
             <w:rPr>
               <w:rFonts w:eastAsiaTheme="minorEastAsia"/>
               <w:noProof/>
@@ -1099,14 +1171,42 @@
                 <w:rStyle w:val="Hipervnculo"/>
                 <w:noProof/>
               </w:rPr>
-              <w:t>4.Perfil del turista</w:t>
+              <w:t>4.</w:t>
             </w:r>
             <w:r>
               <w:rPr>
                 <w:rStyle w:val="Hipervnculo"/>
                 <w:noProof/>
               </w:rPr>
-              <w:t>…………………………………………………………………………………………………..</w:t>
+              <w:t xml:space="preserve"> </w:t>
+            </w:r>
+            <w:r>
+              <w:rPr>
+                <w:rStyle w:val="Hipervnculo"/>
+                <w:noProof/>
+              </w:rPr>
+              <w:t>Perfil del turista</w:t>
+            </w:r>
+            <w:r>
+              <w:rPr>
+                <w:rStyle w:val="Hipervnculo"/>
+                <w:noProof/>
+              </w:rPr>
+              <w:t>…………………………………………………………………</w:t>
+            </w:r>
+            <w:r>
+              <w:rPr>
+                <w:rStyle w:val="Hipervnculo"/>
+                <w:noProof/>
+              </w:rPr>
+              <w:t>..</w:t>
+            </w:r>
+            <w:r>
+              <w:rPr>
+                <w:rStyle w:val="Hipervnculo"/>
+                <w:noProof/>
+              </w:rPr>
+              <w:t>……………………………..</w:t>
             </w:r>
             <w:r>
               <w:rPr>
@@ -1154,9 +1254,6 @@
         <w:p>
           <w:pPr>
             <w:pStyle w:val="TDC1"/>
-            <w:tabs>
-              <w:tab w:val="right" w:leader="dot" w:pos="10338"/>
-            </w:tabs>
             <w:rPr>
               <w:rFonts w:eastAsiaTheme="minorEastAsia"/>
               <w:noProof/>
@@ -1179,7 +1276,7 @@
                 <w:noProof/>
                 <w:webHidden/>
               </w:rPr>
-              <w:tab/>
+              <w:t>…………………………………………………………………………………………………………………..</w:t>
             </w:r>
             <w:r>
               <w:rPr>
@@ -1227,9 +1324,6 @@
         <w:p>
           <w:pPr>
             <w:pStyle w:val="TDC1"/>
-            <w:tabs>
-              <w:tab w:val="right" w:leader="dot" w:pos="10338"/>
-            </w:tabs>
             <w:rPr>
               <w:rFonts w:eastAsiaTheme="minorEastAsia"/>
               <w:noProof/>
@@ -1252,7 +1346,7 @@
                 <w:noProof/>
                 <w:webHidden/>
               </w:rPr>
-              <w:tab/>
+              <w:t>………………………………………………………………………………………</w:t>
             </w:r>
             <w:r>
               <w:rPr>
@@ -1300,9 +1394,6 @@
         <w:p>
           <w:pPr>
             <w:pStyle w:val="TDC1"/>
-            <w:tabs>
-              <w:tab w:val="right" w:leader="dot" w:pos="10338"/>
-            </w:tabs>
             <w:rPr>
               <w:rFonts w:eastAsiaTheme="minorEastAsia"/>
               <w:noProof/>
@@ -1325,7 +1416,7 @@
                 <w:noProof/>
                 <w:webHidden/>
               </w:rPr>
-              <w:tab/>
+              <w:t>…………………………………………………………………………………………………………………</w:t>
             </w:r>
             <w:r>
               <w:rPr>
@@ -1373,9 +1464,6 @@
         <w:p>
           <w:pPr>
             <w:pStyle w:val="TDC1"/>
-            <w:tabs>
-              <w:tab w:val="right" w:leader="dot" w:pos="10338"/>
-            </w:tabs>
             <w:rPr>
               <w:rFonts w:eastAsiaTheme="minorEastAsia"/>
               <w:noProof/>
@@ -1399,7 +1487,7 @@
                 <w:noProof/>
                 <w:webHidden/>
               </w:rPr>
-              <w:tab/>
+              <w:t>………………………………………………………………………………………</w:t>
             </w:r>
             <w:r>
               <w:rPr>
@@ -1447,9 +1535,6 @@
         <w:p>
           <w:pPr>
             <w:pStyle w:val="TDC1"/>
-            <w:tabs>
-              <w:tab w:val="right" w:leader="dot" w:pos="10338"/>
-            </w:tabs>
             <w:rPr>
               <w:rFonts w:eastAsiaTheme="minorEastAsia"/>
               <w:noProof/>
@@ -1472,7 +1557,7 @@
                 <w:noProof/>
                 <w:webHidden/>
               </w:rPr>
-              <w:tab/>
+              <w:t>…………………………………………………………………………………………………………………</w:t>
             </w:r>
             <w:r>
               <w:rPr>
@@ -1540,10 +1625,6 @@
     <w:p>
       <w:pPr>
         <w:pStyle w:val="TDC1"/>
-        <w:rPr>
-          <w:rFonts w:cstheme="minorHAnsi"/>
-          <w:szCs w:val="28"/>
-        </w:rPr>
         <w:sectPr>
           <w:footerReference w:type="default" r:id="rId12"/>
           <w:pgSz w:w="12240" w:h="15840"/>
@@ -1808,7 +1889,19 @@
               <w:rPr>
                 <w:lang w:val="es-419" w:eastAsia="es-CO"/>
               </w:rPr>
-              <w:t xml:space="preserve">Bienvenidos al componente sobre claves para entender al turista. Cada destino turístico encierra la esencia que lo define y lo diferencia de cualquier otro lugar; representa la suma de características que el visitante percibe y experimenta, dejando una impresión única y duradera. Esta identidad se construye a partir de elementos tangibles e intangibles como el patrimonio cultural, la historia, las tradiciones, los paisajes naturales, la gastronomía y la hospitalidad de sus habitantes. Comprender la identidad del destino es esencial para su éxito, pues permite a los gestores turísticos y a las comunidades locales diseñar estrategias de marca efectivas, atraer al público objetivo y promover un desarrollo sostenible. Cada destino comunica una historia, </w:t>
+              <w:t xml:space="preserve">Bienvenidos al componente sobre </w:t>
+            </w:r>
+            <w:r>
+              <w:rPr>
+                <w:lang w:val="es-419" w:eastAsia="es-CO"/>
+              </w:rPr>
+              <w:t>C</w:t>
+            </w:r>
+            <w:r>
+              <w:rPr>
+                <w:lang w:val="es-419" w:eastAsia="es-CO"/>
+              </w:rPr>
+              <w:t xml:space="preserve">laves para entender al turista. Cada destino turístico encierra la esencia que lo define y lo diferencia de cualquier otro lugar; representa la suma de características que el visitante percibe y experimenta, dejando una impresión única y duradera. Esta identidad se construye a partir de elementos tangibles e intangibles como el patrimonio cultural, la historia, las tradiciones, los paisajes naturales, la gastronomía y la hospitalidad de sus habitantes. Comprender la identidad del destino es esencial para su éxito, pues permite a los gestores turísticos y a las comunidades locales diseñar estrategias de marca efectivas, atraer al público objetivo y promover un desarrollo sostenible. Cada destino comunica una historia, </w:t>
             </w:r>
             <w:r>
               <w:rPr>
@@ -5695,7 +5788,19 @@
         <w:rPr>
           <w:lang w:eastAsia="es-CO"/>
         </w:rPr>
-        <w:t>Busca descanso, relajación y bienestar físico y emocional. Prefiere destinos cálidos, con playas, hoteles todos incluidos y actividades recreativas acuáticas. Su motivación principal es escapar de la rutina y disfrutar del ocio en entornos tranquilos.</w:t>
+        <w:t>Busca descanso, relajación y bienestar físico y emocional. Prefiere destinos cálidos, con playas, hoteles todo incluido</w:t>
+      </w:r>
+      <w:r>
+        <w:rPr>
+          <w:lang w:eastAsia="es-CO"/>
+        </w:rPr>
+        <w:t xml:space="preserve"> </w:t>
+      </w:r>
+      <w:r>
+        <w:rPr>
+          <w:lang w:eastAsia="es-CO"/>
+        </w:rPr>
+        <w:t>y actividades recreativas acuáticas. Su motivación principal es escapar de la rutina y disfrutar del ocio en entornos tranquilos.</w:t>
       </w:r>
     </w:p>
     <w:p>
@@ -12223,8 +12328,12 @@
     <w:autoRedefine/>
     <w:uiPriority w:val="39"/>
     <w:unhideWhenUsed/>
-    <w:rsid w:val="000434FA"/>
+    <w:rsid w:val="00192296"/>
     <w:pPr>
+      <w:tabs>
+        <w:tab w:val="left" w:pos="9498"/>
+        <w:tab w:val="right" w:leader="dot" w:pos="10338"/>
+      </w:tabs>
       <w:spacing w:after="100"/>
     </w:pPr>
   </w:style>
@@ -12871,10 +12980,6 @@
 </file>
 
 <file path=customXml/item1.xml><?xml version="1.0" encoding="utf-8"?>
-<b:Sources xmlns:b="http://schemas.openxmlformats.org/officeDocument/2006/bibliography" xmlns="http://schemas.openxmlformats.org/officeDocument/2006/bibliography" SelectedStyle="\APASixthEditionOfficeOnline.xsl" StyleName="APA" Version="6"/>
-</file>
-
-<file path=customXml/item2.xml><?xml version="1.0" encoding="utf-8"?>
 <p:properties xmlns:p="http://schemas.microsoft.com/office/2006/metadata/properties" xmlns:xsi="http://www.w3.org/2001/XMLSchema-instance" xmlns:pc="http://schemas.microsoft.com/office/infopath/2007/PartnerControls">
   <documentManagement>
     <TaxCatchAll xmlns="285d351f-f218-493a-825f-85a9dfbde315" xsi:nil="true"/>
@@ -12885,7 +12990,20 @@
 </p:properties>
 </file>
 
+<file path=customXml/item2.xml><?xml version="1.0" encoding="utf-8"?>
+<b:Sources xmlns:b="http://schemas.openxmlformats.org/officeDocument/2006/bibliography" xmlns="http://schemas.openxmlformats.org/officeDocument/2006/bibliography" SelectedStyle="\APASixthEditionOfficeOnline.xsl" StyleName="APA" Version="6"/>
+</file>
+
 <file path=customXml/item3.xml><?xml version="1.0" encoding="utf-8"?>
+<?mso-contentType ?>
+<FormTemplates xmlns="http://schemas.microsoft.com/sharepoint/v3/contenttype/forms">
+  <Display>DocumentLibraryForm</Display>
+  <Edit>DocumentLibraryForm</Edit>
+  <New>DocumentLibraryForm</New>
+</FormTemplates>
+</file>
+
+<file path=customXml/item4.xml><?xml version="1.0" encoding="utf-8"?>
 <ct:contentTypeSchema xmlns:ct="http://schemas.microsoft.com/office/2006/metadata/contentType" xmlns:ma="http://schemas.microsoft.com/office/2006/metadata/properties/metaAttributes" ct:_="" ma:_="" ma:contentTypeName="Documento" ma:contentTypeID="0x0101005D7421CBAB376F47AC1876466873BE0C" ma:contentTypeVersion="11" ma:contentTypeDescription="Crear nuevo documento." ma:contentTypeScope="" ma:versionID="c355e60b4cde5dbb71daba652f90dcaf">
   <xsd:schema xmlns:xsd="http://www.w3.org/2001/XMLSchema" xmlns:xs="http://www.w3.org/2001/XMLSchema" xmlns:p="http://schemas.microsoft.com/office/2006/metadata/properties" xmlns:ns2="55abea07-cd72-4a95-add0-1082a24cf9e9" xmlns:ns3="285d351f-f218-493a-825f-85a9dfbde315" targetNamespace="http://schemas.microsoft.com/office/2006/metadata/properties" ma:root="true" ma:fieldsID="af45bf235921137d7bf462656222ea5a" ns2:_="" ns3:_="">
     <xsd:import namespace="55abea07-cd72-4a95-add0-1082a24cf9e9"/>
@@ -13080,24 +13198,7 @@
 </ct:contentTypeSchema>
 </file>
 
-<file path=customXml/item4.xml><?xml version="1.0" encoding="utf-8"?>
-<?mso-contentType ?>
-<FormTemplates xmlns="http://schemas.microsoft.com/sharepoint/v3/contenttype/forms">
-  <Display>DocumentLibraryForm</Display>
-  <Edit>DocumentLibraryForm</Edit>
-  <New>DocumentLibraryForm</New>
-</FormTemplates>
-</file>
-
 <file path=customXml/itemProps1.xml><?xml version="1.0" encoding="utf-8"?>
-<ds:datastoreItem xmlns:ds="http://schemas.openxmlformats.org/officeDocument/2006/customXml" ds:itemID="{A9F2CEBA-C824-4C86-81A8-E32CBD0EB92D}">
-  <ds:schemaRefs>
-    <ds:schemaRef ds:uri="http://schemas.openxmlformats.org/officeDocument/2006/bibliography"/>
-  </ds:schemaRefs>
-</ds:datastoreItem>
-</file>
-
-<file path=customXml/itemProps2.xml><?xml version="1.0" encoding="utf-8"?>
 <ds:datastoreItem xmlns:ds="http://schemas.openxmlformats.org/officeDocument/2006/customXml" ds:itemID="{26259216-AD86-464A-AEAD-95B1F9E17392}">
   <ds:schemaRefs>
     <ds:schemaRef ds:uri="http://schemas.microsoft.com/office/2006/metadata/properties"/>
@@ -13108,7 +13209,23 @@
 </ds:datastoreItem>
 </file>
 
+<file path=customXml/itemProps2.xml><?xml version="1.0" encoding="utf-8"?>
+<ds:datastoreItem xmlns:ds="http://schemas.openxmlformats.org/officeDocument/2006/customXml" ds:itemID="{A9F2CEBA-C824-4C86-81A8-E32CBD0EB92D}">
+  <ds:schemaRefs>
+    <ds:schemaRef ds:uri="http://schemas.openxmlformats.org/officeDocument/2006/bibliography"/>
+  </ds:schemaRefs>
+</ds:datastoreItem>
+</file>
+
 <file path=customXml/itemProps3.xml><?xml version="1.0" encoding="utf-8"?>
+<ds:datastoreItem xmlns:ds="http://schemas.openxmlformats.org/officeDocument/2006/customXml" ds:itemID="{D00A4A46-BDBD-48AC-87B9-2BA42D9CC06F}">
+  <ds:schemaRefs>
+    <ds:schemaRef ds:uri="http://schemas.microsoft.com/sharepoint/v3/contenttype/forms"/>
+  </ds:schemaRefs>
+</ds:datastoreItem>
+</file>
+
+<file path=customXml/itemProps4.xml><?xml version="1.0" encoding="utf-8"?>
 <ds:datastoreItem xmlns:ds="http://schemas.openxmlformats.org/officeDocument/2006/customXml" ds:itemID="{F2EE7819-7B7A-45A1-999C-9867D1A29F33}">
   <ds:schemaRefs>
     <ds:schemaRef ds:uri="http://schemas.microsoft.com/office/2006/metadata/contentType"/>
@@ -13125,12 +13242,4 @@
     <ds:schemaRef ds:uri="http://schemas.microsoft.com/internal/obd"/>
   </ds:schemaRefs>
 </ds:datastoreItem>
-</file>
-
-<file path=customXml/itemProps4.xml><?xml version="1.0" encoding="utf-8"?>
-<ds:datastoreItem xmlns:ds="http://schemas.openxmlformats.org/officeDocument/2006/customXml" ds:itemID="{D00A4A46-BDBD-48AC-87B9-2BA42D9CC06F}">
-  <ds:schemaRefs>
-    <ds:schemaRef ds:uri="http://schemas.microsoft.com/sharepoint/v3/contenttype/forms"/>
-  </ds:schemaRefs>
-</ds:datastoreItem>
 </file>
</xml_diff>